<commit_message>
fix(w3): fail loudly on malformed labels, unreadable video and failed image writes; select op point by Drone F1 (#19, #10, #11)
- w3_analyze_baseline: load_gt validates 5 fields, class id, normalized coords and has_bbox; LabelError with path:line
- w3_review_sheets: malformed labels shown and counted, not treated as unlabeled; check VideoCapture.isOpened, frame reads and cv2.imwrite
- w3_export_yolo: check VideoCapture.isOpened and cv2.imwrite
- operating point: max Drone F1 on val, tie -> higher conf (training_protocol.md section 7)
- ADR-0004, results/W03/README, W3 reports: offset check described as exploratory, not independent blind review
</commit_message>
<xml_diff>
--- a/reports/w3/E1_W03_bao_cao_cong_viec.docx
+++ b/reports/w3/E1_W03_bao_cao_cong_viec.docx
@@ -509,7 +509,23 @@
               <w:rPr>
                 <w:sz w:val="17"/>
               </w:rPr>
-              <w:t>PR #23, #25, #26 đã gửi yêu cầu review tới An; tới ngày lập báo cáo chưa có review trên GitHub, PR được merge theo ruleset hiện hành (không bắt buộc approve).</w:t>
+              <w:t xml:space="preserve">An review PR #22 (approve bằng comment), #23, #25, #26 sau khi merge, nêu 3 lỗi kỹ thuật; đã sửa trong </w:t>
+            </w:r>
+            <w:hyperlink r:id="rId28">
+              <w:r>
+                <w:rPr>
+                  <w:color w:val="0563C1"/>
+                  <w:u w:val="single"/>
+                  <w:sz w:val="17"/>
+                </w:rPr>
+                <w:t xml:space="preserve">PR #28</w:t>
+              </w:r>
+            </w:hyperlink>
+            <w:r>
+              <w:rPr>
+                <w:sz w:val="17"/>
+              </w:rPr>
+              <w:t xml:space="preserve"> (gửi An review trước khi merge). Từ W4: mọi PR đều gửi yêu cầu review tới An trước khi merge.</w:t>
             </w:r>
           </w:p>
         </w:tc>
@@ -791,7 +807,7 @@
               <w:rPr>
                 <w:sz w:val="17"/>
               </w:rPr>
-              <w:t>Chính sách căn nhãn: độ nhạy IoU + xem mù có đối chứng</w:t>
+              <w:t>Chính sách căn nhãn: độ nhạy IoU + thăm dò bằng mắt có đối chứng</w:t>
             </w:r>
           </w:p>
         </w:tc>
@@ -1505,7 +1521,7 @@
               <w:rPr>
                 <w:sz w:val="16"/>
               </w:rPr>
-              <w:t>mAP/PR chưa có (run 04 đang chạy); xem mù đối chứng chỉ 53% → không xác định chiều lệch; val chỉ 3 video Bird; 77/242 video chưa xem bằng mắt; #7 chưa chốt với GVHD</w:t>
+              <w:t>mAP/PR chưa có (run 04 đang chạy); thăm dò bằng mắt: đối chứng chỉ 53% → không xác định chiều lệch; val chỉ 3 video Bird; 77/242 video chưa xem bằng mắt; #7 chưa chốt với GVHD</w:t>
             </w:r>
           </w:p>
         </w:tc>
@@ -1699,7 +1715,7 @@
               <w:rPr>
                 <w:sz w:val="17"/>
               </w:rPr>
-              <w:t>Xem mù nhóm đối chứng</w:t>
+              <w:t>Thăm dò offset bằng mắt (không phải review mù độc lập)</w:t>
             </w:r>
           </w:p>
         </w:tc>
@@ -1713,7 +1729,7 @@
               <w:rPr>
                 <w:sz w:val="17"/>
               </w:rPr>
-              <w:t>53% (8/15) &lt; ngưỡng 80% → không kết luận</w:t>
+              <w:t>Đối chứng 53% (8/15) &lt; ngưỡng 80% → không kết luận</w:t>
             </w:r>
           </w:p>
         </w:tc>

</xml_diff>